<commit_message>
Edited and updated null aware elements in collections
</commit_message>
<xml_diff>
--- a/d1_dart_null_safety.docx
+++ b/d1_dart_null_safety.docx
@@ -3092,7 +3092,25 @@
           <w:sz w:val="36"/>
           <w:szCs w:val="36"/>
         </w:rPr>
-        <w:t>Null Aware Elements (?) in Column/Row:</w:t>
+        <w:t xml:space="preserve">Null Aware Elements (?) in </w:t>
+      </w:r>
+      <w:r>
+        <w:rPr>
+          <w:b/>
+          <w:bCs/>
+          <w:sz w:val="36"/>
+          <w:szCs w:val="36"/>
+        </w:rPr>
+        <w:t>Collections/</w:t>
+      </w:r>
+      <w:r>
+        <w:rPr>
+          <w:b/>
+          <w:bCs/>
+          <w:sz w:val="36"/>
+          <w:szCs w:val="36"/>
+        </w:rPr>
+        <w:t>Column/Row:</w:t>
       </w:r>
     </w:p>
     <w:p>
@@ -3172,7 +3190,37 @@
           <w:sz w:val="36"/>
           <w:szCs w:val="36"/>
         </w:rPr>
-        <w:t xml:space="preserve"> block. Like if a widget, builder or method can </w:t>
+        <w:t xml:space="preserve"> block</w:t>
+      </w:r>
+      <w:r>
+        <w:rPr>
+          <w:sz w:val="36"/>
+          <w:szCs w:val="36"/>
+        </w:rPr>
+        <w:t xml:space="preserve"> inside Lists, Sets and Maps</w:t>
+      </w:r>
+    </w:p>
+    <w:p>
+      <w:pPr>
+        <w:jc w:val="both"/>
+        <w:rPr>
+          <w:sz w:val="36"/>
+          <w:szCs w:val="36"/>
+        </w:rPr>
+      </w:pPr>
+      <w:r>
+        <w:rPr>
+          <w:sz w:val="36"/>
+          <w:szCs w:val="36"/>
+        </w:rPr>
+        <w:t xml:space="preserve"># </w:t>
+      </w:r>
+      <w:r>
+        <w:rPr>
+          <w:sz w:val="36"/>
+          <w:szCs w:val="36"/>
+        </w:rPr>
+        <w:t xml:space="preserve">Like if a widget, builder or method can </w:t>
       </w:r>
       <w:r>
         <w:rPr>
@@ -3188,39 +3236,441 @@
           <w:sz w:val="36"/>
           <w:szCs w:val="36"/>
         </w:rPr>
-        <w:t xml:space="preserve">, so we have to check it before displaying in widget tree. If </w:t>
+        <w:t xml:space="preserve">, so we have to check it before displaying </w:t>
+      </w:r>
+      <w:r>
+        <w:rPr>
+          <w:sz w:val="36"/>
+          <w:szCs w:val="36"/>
+        </w:rPr>
+        <w:t xml:space="preserve">it </w:t>
+      </w:r>
+      <w:r>
+        <w:rPr>
+          <w:sz w:val="36"/>
+          <w:szCs w:val="36"/>
+        </w:rPr>
+        <w:t xml:space="preserve">in </w:t>
+      </w:r>
+      <w:r>
+        <w:rPr>
+          <w:sz w:val="36"/>
+          <w:szCs w:val="36"/>
+        </w:rPr>
+        <w:t>the W</w:t>
+      </w:r>
+      <w:r>
+        <w:rPr>
+          <w:sz w:val="36"/>
+          <w:szCs w:val="36"/>
+        </w:rPr>
+        <w:t xml:space="preserve">idget </w:t>
+      </w:r>
+      <w:r>
+        <w:rPr>
+          <w:sz w:val="36"/>
+          <w:szCs w:val="36"/>
+        </w:rPr>
+        <w:t>T</w:t>
+      </w:r>
+      <w:r>
+        <w:rPr>
+          <w:sz w:val="36"/>
+          <w:szCs w:val="36"/>
+        </w:rPr>
+        <w:t xml:space="preserve">ree. If </w:t>
+      </w:r>
+      <w:r>
+        <w:rPr>
+          <w:sz w:val="36"/>
+          <w:szCs w:val="36"/>
+        </w:rPr>
+        <w:t>it’s</w:t>
+      </w:r>
+      <w:r>
+        <w:rPr>
+          <w:sz w:val="36"/>
+          <w:szCs w:val="36"/>
+        </w:rPr>
+        <w:t xml:space="preserve"> not</w:t>
+      </w:r>
+      <w:r>
+        <w:rPr>
+          <w:b/>
+          <w:bCs/>
+          <w:sz w:val="36"/>
+          <w:szCs w:val="36"/>
+        </w:rPr>
+        <w:t xml:space="preserve"> null</w:t>
+      </w:r>
+      <w:r>
+        <w:rPr>
+          <w:sz w:val="36"/>
+          <w:szCs w:val="36"/>
+        </w:rPr>
+        <w:t xml:space="preserve"> then the widget is displayed.</w:t>
+      </w:r>
+    </w:p>
+    <w:p>
+      <w:pPr>
+        <w:jc w:val="both"/>
+        <w:rPr>
+          <w:sz w:val="36"/>
+          <w:szCs w:val="36"/>
+        </w:rPr>
+      </w:pPr>
+      <w:r>
+        <w:rPr>
+          <w:sz w:val="36"/>
+          <w:szCs w:val="36"/>
+        </w:rPr>
+        <w:lastRenderedPageBreak/>
+        <w:t xml:space="preserve"># </w:t>
+      </w:r>
+      <w:r>
+        <w:rPr>
+          <w:sz w:val="36"/>
+          <w:szCs w:val="36"/>
+        </w:rPr>
+        <w:t>Before or old way:</w:t>
+      </w:r>
+    </w:p>
+    <w:p>
+      <w:pPr>
+        <w:jc w:val="both"/>
+        <w:rPr>
+          <w:b/>
+          <w:bCs/>
+          <w:color w:val="D86DCB" w:themeColor="accent5" w:themeTint="99"/>
+          <w:sz w:val="36"/>
+          <w:szCs w:val="36"/>
+        </w:rPr>
+      </w:pPr>
+      <w:r>
+        <w:rPr>
+          <w:b/>
+          <w:bCs/>
+          <w:color w:val="D86DCB" w:themeColor="accent5" w:themeTint="99"/>
+          <w:sz w:val="36"/>
+          <w:szCs w:val="36"/>
+        </w:rPr>
+        <w:t>Column(</w:t>
+      </w:r>
+    </w:p>
+    <w:p>
+      <w:pPr>
+        <w:jc w:val="both"/>
+        <w:rPr>
+          <w:b/>
+          <w:bCs/>
+          <w:color w:val="D86DCB" w:themeColor="accent5" w:themeTint="99"/>
+          <w:sz w:val="36"/>
+          <w:szCs w:val="36"/>
+        </w:rPr>
+      </w:pPr>
+      <w:r>
+        <w:rPr>
+          <w:b/>
+          <w:bCs/>
+          <w:color w:val="D86DCB" w:themeColor="accent5" w:themeTint="99"/>
+          <w:sz w:val="36"/>
+          <w:szCs w:val="36"/>
+        </w:rPr>
+        <w:t xml:space="preserve">    children: [</w:t>
+      </w:r>
+    </w:p>
+    <w:p>
+      <w:pPr>
+        <w:jc w:val="both"/>
+        <w:rPr>
+          <w:b/>
+          <w:bCs/>
+          <w:color w:val="D86DCB" w:themeColor="accent5" w:themeTint="99"/>
+          <w:sz w:val="36"/>
+          <w:szCs w:val="36"/>
+        </w:rPr>
+      </w:pPr>
+      <w:r>
+        <w:rPr>
+          <w:b/>
+          <w:bCs/>
+          <w:color w:val="D86DCB" w:themeColor="accent5" w:themeTint="99"/>
+          <w:sz w:val="36"/>
+          <w:szCs w:val="36"/>
+        </w:rPr>
+        <w:t xml:space="preserve">       Text('Title'),</w:t>
+      </w:r>
+    </w:p>
+    <w:p>
+      <w:pPr>
+        <w:jc w:val="both"/>
+        <w:rPr>
+          <w:b/>
+          <w:bCs/>
+          <w:color w:val="D86DCB" w:themeColor="accent5" w:themeTint="99"/>
+          <w:sz w:val="36"/>
+          <w:szCs w:val="36"/>
+        </w:rPr>
+      </w:pPr>
+      <w:r>
+        <w:rPr>
+          <w:b/>
+          <w:bCs/>
+          <w:color w:val="D86DCB" w:themeColor="accent5" w:themeTint="99"/>
+          <w:sz w:val="36"/>
+          <w:szCs w:val="36"/>
+        </w:rPr>
+        <w:t xml:space="preserve">       If(</w:t>
       </w:r>
       <w:proofErr w:type="spellStart"/>
       <w:r>
         <w:rPr>
-          <w:sz w:val="36"/>
-          <w:szCs w:val="36"/>
-        </w:rPr>
-        <w:t>its</w:t>
+          <w:b/>
+          <w:bCs/>
+          <w:color w:val="D86DCB" w:themeColor="accent5" w:themeTint="99"/>
+          <w:sz w:val="36"/>
+          <w:szCs w:val="36"/>
+        </w:rPr>
+        <w:t>subTitleWidget</w:t>
       </w:r>
       <w:proofErr w:type="spellEnd"/>
       <w:r>
         <w:rPr>
-          <w:sz w:val="36"/>
-          <w:szCs w:val="36"/>
-        </w:rPr>
-        <w:t xml:space="preserve"> not</w:t>
-      </w:r>
-      <w:r>
-        <w:rPr>
-          <w:b/>
-          <w:bCs/>
-          <w:sz w:val="36"/>
-          <w:szCs w:val="36"/>
-        </w:rPr>
-        <w:t xml:space="preserve"> null</w:t>
-      </w:r>
-      <w:r>
-        <w:rPr>
-          <w:sz w:val="36"/>
-          <w:szCs w:val="36"/>
-        </w:rPr>
-        <w:t xml:space="preserve"> then the widget is displayed. Before or old way:</w:t>
+          <w:b/>
+          <w:bCs/>
+          <w:color w:val="D86DCB" w:themeColor="accent5" w:themeTint="99"/>
+          <w:sz w:val="36"/>
+          <w:szCs w:val="36"/>
+        </w:rPr>
+        <w:t xml:space="preserve"> != null) </w:t>
+      </w:r>
+      <w:proofErr w:type="spellStart"/>
+      <w:r>
+        <w:rPr>
+          <w:b/>
+          <w:bCs/>
+          <w:color w:val="D86DCB" w:themeColor="accent5" w:themeTint="99"/>
+          <w:sz w:val="36"/>
+          <w:szCs w:val="36"/>
+        </w:rPr>
+        <w:t>subTitleWidget</w:t>
+      </w:r>
+      <w:proofErr w:type="spellEnd"/>
+      <w:r>
+        <w:rPr>
+          <w:b/>
+          <w:bCs/>
+          <w:color w:val="D86DCB" w:themeColor="accent5" w:themeTint="99"/>
+          <w:sz w:val="36"/>
+          <w:szCs w:val="36"/>
+        </w:rPr>
+        <w:t>,</w:t>
+      </w:r>
+    </w:p>
+    <w:p>
+      <w:pPr>
+        <w:jc w:val="both"/>
+        <w:rPr>
+          <w:b/>
+          <w:bCs/>
+          <w:color w:val="D86DCB" w:themeColor="accent5" w:themeTint="99"/>
+          <w:sz w:val="36"/>
+          <w:szCs w:val="36"/>
+        </w:rPr>
+      </w:pPr>
+      <w:r>
+        <w:rPr>
+          <w:b/>
+          <w:bCs/>
+          <w:color w:val="D86DCB" w:themeColor="accent5" w:themeTint="99"/>
+          <w:sz w:val="36"/>
+          <w:szCs w:val="36"/>
+        </w:rPr>
+        <w:t xml:space="preserve">       If(</w:t>
+      </w:r>
+      <w:proofErr w:type="spellStart"/>
+      <w:r>
+        <w:rPr>
+          <w:b/>
+          <w:bCs/>
+          <w:color w:val="D86DCB" w:themeColor="accent5" w:themeTint="99"/>
+          <w:sz w:val="36"/>
+          <w:szCs w:val="36"/>
+        </w:rPr>
+        <w:t>iconWidget</w:t>
+      </w:r>
+      <w:proofErr w:type="spellEnd"/>
+      <w:r>
+        <w:rPr>
+          <w:b/>
+          <w:bCs/>
+          <w:color w:val="D86DCB" w:themeColor="accent5" w:themeTint="99"/>
+          <w:sz w:val="36"/>
+          <w:szCs w:val="36"/>
+        </w:rPr>
+        <w:t xml:space="preserve"> != null) </w:t>
+      </w:r>
+      <w:proofErr w:type="spellStart"/>
+      <w:r>
+        <w:rPr>
+          <w:b/>
+          <w:bCs/>
+          <w:color w:val="D86DCB" w:themeColor="accent5" w:themeTint="99"/>
+          <w:sz w:val="36"/>
+          <w:szCs w:val="36"/>
+        </w:rPr>
+        <w:t>iconWidget</w:t>
+      </w:r>
+      <w:proofErr w:type="spellEnd"/>
+      <w:r>
+        <w:rPr>
+          <w:b/>
+          <w:bCs/>
+          <w:color w:val="D86DCB" w:themeColor="accent5" w:themeTint="99"/>
+          <w:sz w:val="36"/>
+          <w:szCs w:val="36"/>
+        </w:rPr>
+        <w:t>,</w:t>
+      </w:r>
+    </w:p>
+    <w:p>
+      <w:pPr>
+        <w:jc w:val="both"/>
+        <w:rPr>
+          <w:b/>
+          <w:bCs/>
+          <w:color w:val="D86DCB" w:themeColor="accent5" w:themeTint="99"/>
+          <w:sz w:val="36"/>
+          <w:szCs w:val="36"/>
+        </w:rPr>
+      </w:pPr>
+      <w:r>
+        <w:rPr>
+          <w:b/>
+          <w:bCs/>
+          <w:color w:val="D86DCB" w:themeColor="accent5" w:themeTint="99"/>
+          <w:sz w:val="36"/>
+          <w:szCs w:val="36"/>
+        </w:rPr>
+        <w:t xml:space="preserve">       If(</w:t>
+      </w:r>
+      <w:proofErr w:type="spellStart"/>
+      <w:r>
+        <w:rPr>
+          <w:b/>
+          <w:bCs/>
+          <w:color w:val="D86DCB" w:themeColor="accent5" w:themeTint="99"/>
+          <w:sz w:val="36"/>
+          <w:szCs w:val="36"/>
+        </w:rPr>
+        <w:t>footerWidget</w:t>
+      </w:r>
+      <w:proofErr w:type="spellEnd"/>
+      <w:r>
+        <w:rPr>
+          <w:b/>
+          <w:bCs/>
+          <w:color w:val="D86DCB" w:themeColor="accent5" w:themeTint="99"/>
+          <w:sz w:val="36"/>
+          <w:szCs w:val="36"/>
+        </w:rPr>
+        <w:t xml:space="preserve"> != null) </w:t>
+      </w:r>
+      <w:proofErr w:type="spellStart"/>
+      <w:r>
+        <w:rPr>
+          <w:b/>
+          <w:bCs/>
+          <w:color w:val="D86DCB" w:themeColor="accent5" w:themeTint="99"/>
+          <w:sz w:val="36"/>
+          <w:szCs w:val="36"/>
+        </w:rPr>
+        <w:t>footerWidget</w:t>
+      </w:r>
+      <w:proofErr w:type="spellEnd"/>
+      <w:r>
+        <w:rPr>
+          <w:b/>
+          <w:bCs/>
+          <w:color w:val="D86DCB" w:themeColor="accent5" w:themeTint="99"/>
+          <w:sz w:val="36"/>
+          <w:szCs w:val="36"/>
+        </w:rPr>
+        <w:t>,</w:t>
+      </w:r>
+    </w:p>
+    <w:p>
+      <w:pPr>
+        <w:jc w:val="both"/>
+        <w:rPr>
+          <w:b/>
+          <w:bCs/>
+          <w:color w:val="D86DCB" w:themeColor="accent5" w:themeTint="99"/>
+          <w:sz w:val="36"/>
+          <w:szCs w:val="36"/>
+        </w:rPr>
+      </w:pPr>
+      <w:r>
+        <w:rPr>
+          <w:b/>
+          <w:bCs/>
+          <w:color w:val="D86DCB" w:themeColor="accent5" w:themeTint="99"/>
+          <w:sz w:val="36"/>
+          <w:szCs w:val="36"/>
+        </w:rPr>
+        <w:t xml:space="preserve">    ],</w:t>
+      </w:r>
+    </w:p>
+    <w:p>
+      <w:pPr>
+        <w:jc w:val="both"/>
+        <w:rPr>
+          <w:b/>
+          <w:bCs/>
+          <w:color w:val="D86DCB" w:themeColor="accent5" w:themeTint="99"/>
+          <w:sz w:val="36"/>
+          <w:szCs w:val="36"/>
+        </w:rPr>
+      </w:pPr>
+      <w:r>
+        <w:rPr>
+          <w:b/>
+          <w:bCs/>
+          <w:color w:val="D86DCB" w:themeColor="accent5" w:themeTint="99"/>
+          <w:sz w:val="36"/>
+          <w:szCs w:val="36"/>
+        </w:rPr>
+        <w:t>)</w:t>
+      </w:r>
+    </w:p>
+    <w:p>
+      <w:pPr>
+        <w:jc w:val="both"/>
+        <w:rPr>
+          <w:sz w:val="36"/>
+          <w:szCs w:val="36"/>
+        </w:rPr>
+      </w:pPr>
+      <w:r>
+        <w:rPr>
+          <w:sz w:val="36"/>
+          <w:szCs w:val="36"/>
+        </w:rPr>
+        <w:t># New way after null aware elements</w:t>
+      </w:r>
+      <w:r>
+        <w:rPr>
+          <w:sz w:val="36"/>
+          <w:szCs w:val="36"/>
+        </w:rPr>
+        <w:t>. Less boilerplate code</w:t>
+      </w:r>
+      <w:r>
+        <w:rPr>
+          <w:sz w:val="36"/>
+          <w:szCs w:val="36"/>
+        </w:rPr>
+        <w:t>:</w:t>
       </w:r>
     </w:p>
     <w:p>
@@ -3264,250 +3714,566 @@
           <w:sz w:val="36"/>
           <w:szCs w:val="36"/>
         </w:rPr>
+        <w:t xml:space="preserve">    children: [</w:t>
+      </w:r>
+    </w:p>
+    <w:p>
+      <w:pPr>
+        <w:jc w:val="both"/>
+        <w:rPr>
+          <w:b/>
+          <w:bCs/>
+          <w:color w:val="D86DCB" w:themeColor="accent5" w:themeTint="99"/>
+          <w:sz w:val="36"/>
+          <w:szCs w:val="36"/>
+        </w:rPr>
+      </w:pPr>
+      <w:r>
+        <w:rPr>
+          <w:b/>
+          <w:bCs/>
+          <w:color w:val="D86DCB" w:themeColor="accent5" w:themeTint="99"/>
+          <w:sz w:val="36"/>
+          <w:szCs w:val="36"/>
+        </w:rPr>
+        <w:t xml:space="preserve">       Text('Title'),</w:t>
+      </w:r>
+    </w:p>
+    <w:p>
+      <w:pPr>
+        <w:jc w:val="both"/>
+        <w:rPr>
+          <w:b/>
+          <w:bCs/>
+          <w:color w:val="D86DCB" w:themeColor="accent5" w:themeTint="99"/>
+          <w:sz w:val="36"/>
+          <w:szCs w:val="36"/>
+        </w:rPr>
+      </w:pPr>
+      <w:r>
+        <w:rPr>
+          <w:b/>
+          <w:bCs/>
+          <w:color w:val="D86DCB" w:themeColor="accent5" w:themeTint="99"/>
+          <w:sz w:val="36"/>
+          <w:szCs w:val="36"/>
+        </w:rPr>
+        <w:t xml:space="preserve">       ?</w:t>
+      </w:r>
+      <w:proofErr w:type="spellStart"/>
+      <w:r>
+        <w:rPr>
+          <w:b/>
+          <w:bCs/>
+          <w:color w:val="D86DCB" w:themeColor="accent5" w:themeTint="99"/>
+          <w:sz w:val="36"/>
+          <w:szCs w:val="36"/>
+        </w:rPr>
+        <w:t>subTitleWidget</w:t>
+      </w:r>
+      <w:proofErr w:type="spellEnd"/>
+      <w:r>
+        <w:rPr>
+          <w:b/>
+          <w:bCs/>
+          <w:color w:val="D86DCB" w:themeColor="accent5" w:themeTint="99"/>
+          <w:sz w:val="36"/>
+          <w:szCs w:val="36"/>
+        </w:rPr>
+        <w:t>,</w:t>
+      </w:r>
+    </w:p>
+    <w:p>
+      <w:pPr>
+        <w:jc w:val="both"/>
+        <w:rPr>
+          <w:b/>
+          <w:bCs/>
+          <w:color w:val="D86DCB" w:themeColor="accent5" w:themeTint="99"/>
+          <w:sz w:val="36"/>
+          <w:szCs w:val="36"/>
+        </w:rPr>
+      </w:pPr>
+      <w:r>
+        <w:rPr>
+          <w:b/>
+          <w:bCs/>
+          <w:color w:val="D86DCB" w:themeColor="accent5" w:themeTint="99"/>
+          <w:sz w:val="36"/>
+          <w:szCs w:val="36"/>
+        </w:rPr>
+        <w:t xml:space="preserve">       ?</w:t>
+      </w:r>
+      <w:proofErr w:type="spellStart"/>
+      <w:r>
+        <w:rPr>
+          <w:b/>
+          <w:bCs/>
+          <w:color w:val="D86DCB" w:themeColor="accent5" w:themeTint="99"/>
+          <w:sz w:val="36"/>
+          <w:szCs w:val="36"/>
+        </w:rPr>
+        <w:t>iconWidget</w:t>
+      </w:r>
+      <w:proofErr w:type="spellEnd"/>
+      <w:r>
+        <w:rPr>
+          <w:b/>
+          <w:bCs/>
+          <w:color w:val="D86DCB" w:themeColor="accent5" w:themeTint="99"/>
+          <w:sz w:val="36"/>
+          <w:szCs w:val="36"/>
+        </w:rPr>
+        <w:t>,</w:t>
+      </w:r>
+    </w:p>
+    <w:p>
+      <w:pPr>
+        <w:jc w:val="both"/>
+        <w:rPr>
+          <w:b/>
+          <w:bCs/>
+          <w:color w:val="D86DCB" w:themeColor="accent5" w:themeTint="99"/>
+          <w:sz w:val="36"/>
+          <w:szCs w:val="36"/>
+        </w:rPr>
+      </w:pPr>
+      <w:r>
+        <w:rPr>
+          <w:b/>
+          <w:bCs/>
+          <w:color w:val="D86DCB" w:themeColor="accent5" w:themeTint="99"/>
+          <w:sz w:val="36"/>
+          <w:szCs w:val="36"/>
+        </w:rPr>
+        <w:t xml:space="preserve">       ?</w:t>
+      </w:r>
+      <w:proofErr w:type="spellStart"/>
+      <w:r>
+        <w:rPr>
+          <w:b/>
+          <w:bCs/>
+          <w:color w:val="D86DCB" w:themeColor="accent5" w:themeTint="99"/>
+          <w:sz w:val="36"/>
+          <w:szCs w:val="36"/>
+        </w:rPr>
+        <w:t>footerWidget</w:t>
+      </w:r>
+      <w:proofErr w:type="spellEnd"/>
+      <w:r>
+        <w:rPr>
+          <w:b/>
+          <w:bCs/>
+          <w:color w:val="D86DCB" w:themeColor="accent5" w:themeTint="99"/>
+          <w:sz w:val="36"/>
+          <w:szCs w:val="36"/>
+        </w:rPr>
+        <w:t>,</w:t>
+      </w:r>
+    </w:p>
+    <w:p>
+      <w:pPr>
+        <w:jc w:val="both"/>
+        <w:rPr>
+          <w:b/>
+          <w:bCs/>
+          <w:color w:val="D86DCB" w:themeColor="accent5" w:themeTint="99"/>
+          <w:sz w:val="36"/>
+          <w:szCs w:val="36"/>
+        </w:rPr>
+      </w:pPr>
+      <w:r>
+        <w:rPr>
+          <w:b/>
+          <w:bCs/>
+          <w:color w:val="D86DCB" w:themeColor="accent5" w:themeTint="99"/>
+          <w:sz w:val="36"/>
+          <w:szCs w:val="36"/>
+        </w:rPr>
+        <w:t xml:space="preserve">    ],</w:t>
+      </w:r>
+    </w:p>
+    <w:p>
+      <w:pPr>
+        <w:jc w:val="both"/>
+        <w:rPr>
+          <w:b/>
+          <w:bCs/>
+          <w:color w:val="D86DCB" w:themeColor="accent5" w:themeTint="99"/>
+          <w:sz w:val="36"/>
+          <w:szCs w:val="36"/>
+        </w:rPr>
+      </w:pPr>
+      <w:r>
+        <w:rPr>
+          <w:b/>
+          <w:bCs/>
+          <w:color w:val="D86DCB" w:themeColor="accent5" w:themeTint="99"/>
+          <w:sz w:val="36"/>
+          <w:szCs w:val="36"/>
+        </w:rPr>
+        <w:t>)</w:t>
+      </w:r>
+    </w:p>
+    <w:p>
+      <w:pPr>
+        <w:jc w:val="both"/>
+        <w:rPr>
+          <w:sz w:val="36"/>
+          <w:szCs w:val="36"/>
+        </w:rPr>
+      </w:pPr>
+      <w:r>
+        <w:rPr>
+          <w:b/>
+          <w:bCs/>
+          <w:sz w:val="36"/>
+          <w:szCs w:val="36"/>
+        </w:rPr>
+        <w:t>NOTE:</w:t>
+      </w:r>
+      <w:r>
+        <w:rPr>
+          <w:sz w:val="36"/>
+          <w:szCs w:val="36"/>
+        </w:rPr>
+        <w:t xml:space="preserve"> But make sure that widget </w:t>
+      </w:r>
+      <w:r>
+        <w:rPr>
+          <w:sz w:val="36"/>
+          <w:szCs w:val="36"/>
+        </w:rPr>
+        <w:t>has to be</w:t>
+      </w:r>
+      <w:r>
+        <w:rPr>
+          <w:sz w:val="36"/>
+          <w:szCs w:val="36"/>
+        </w:rPr>
+        <w:t xml:space="preserve"> nullable</w:t>
+      </w:r>
+      <w:r>
+        <w:rPr>
+          <w:sz w:val="36"/>
+          <w:szCs w:val="36"/>
+        </w:rPr>
+        <w:t>.</w:t>
+      </w:r>
+    </w:p>
+    <w:p>
+      <w:pPr>
+        <w:jc w:val="both"/>
+        <w:rPr>
+          <w:sz w:val="36"/>
+          <w:szCs w:val="36"/>
+        </w:rPr>
+      </w:pPr>
+    </w:p>
+    <w:p>
+      <w:pPr>
+        <w:jc w:val="both"/>
+        <w:rPr>
+          <w:sz w:val="36"/>
+          <w:szCs w:val="36"/>
+        </w:rPr>
+      </w:pPr>
+      <w:r>
+        <w:rPr>
+          <w:sz w:val="36"/>
+          <w:szCs w:val="36"/>
+        </w:rPr>
         <w:lastRenderedPageBreak/>
-        <w:t xml:space="preserve">    children: [</w:t>
-      </w:r>
-    </w:p>
-    <w:p>
-      <w:pPr>
-        <w:jc w:val="both"/>
-        <w:rPr>
-          <w:b/>
-          <w:bCs/>
-          <w:color w:val="D86DCB" w:themeColor="accent5" w:themeTint="99"/>
-          <w:sz w:val="36"/>
-          <w:szCs w:val="36"/>
-        </w:rPr>
-      </w:pPr>
-      <w:r>
-        <w:rPr>
-          <w:b/>
-          <w:bCs/>
-          <w:color w:val="D86DCB" w:themeColor="accent5" w:themeTint="99"/>
-          <w:sz w:val="36"/>
-          <w:szCs w:val="36"/>
-        </w:rPr>
-        <w:t xml:space="preserve">       Text('Title'),</w:t>
-      </w:r>
-    </w:p>
-    <w:p>
-      <w:pPr>
-        <w:jc w:val="both"/>
-        <w:rPr>
-          <w:b/>
-          <w:bCs/>
-          <w:color w:val="D86DCB" w:themeColor="accent5" w:themeTint="99"/>
-          <w:sz w:val="36"/>
-          <w:szCs w:val="36"/>
-        </w:rPr>
-      </w:pPr>
-      <w:r>
-        <w:rPr>
-          <w:b/>
-          <w:bCs/>
-          <w:color w:val="D86DCB" w:themeColor="accent5" w:themeTint="99"/>
-          <w:sz w:val="36"/>
-          <w:szCs w:val="36"/>
-        </w:rPr>
-        <w:t xml:space="preserve">       If(</w:t>
-      </w:r>
-      <w:proofErr w:type="spellStart"/>
-      <w:r>
-        <w:rPr>
-          <w:b/>
-          <w:bCs/>
-          <w:color w:val="D86DCB" w:themeColor="accent5" w:themeTint="99"/>
-          <w:sz w:val="36"/>
-          <w:szCs w:val="36"/>
-        </w:rPr>
-        <w:t>subTitleWidget</w:t>
-      </w:r>
-      <w:proofErr w:type="spellEnd"/>
-      <w:r>
-        <w:rPr>
-          <w:b/>
-          <w:bCs/>
-          <w:color w:val="D86DCB" w:themeColor="accent5" w:themeTint="99"/>
-          <w:sz w:val="36"/>
-          <w:szCs w:val="36"/>
-        </w:rPr>
-        <w:t xml:space="preserve"> != null) </w:t>
-      </w:r>
-      <w:proofErr w:type="spellStart"/>
-      <w:r>
-        <w:rPr>
-          <w:b/>
-          <w:bCs/>
-          <w:color w:val="D86DCB" w:themeColor="accent5" w:themeTint="99"/>
-          <w:sz w:val="36"/>
-          <w:szCs w:val="36"/>
-        </w:rPr>
-        <w:t>subTitleWidget</w:t>
-      </w:r>
-      <w:proofErr w:type="spellEnd"/>
-      <w:r>
-        <w:rPr>
-          <w:b/>
-          <w:bCs/>
-          <w:color w:val="D86DCB" w:themeColor="accent5" w:themeTint="99"/>
-          <w:sz w:val="36"/>
-          <w:szCs w:val="36"/>
-        </w:rPr>
-        <w:t>,</w:t>
-      </w:r>
-    </w:p>
-    <w:p>
-      <w:pPr>
-        <w:jc w:val="both"/>
-        <w:rPr>
-          <w:b/>
-          <w:bCs/>
-          <w:color w:val="D86DCB" w:themeColor="accent5" w:themeTint="99"/>
-          <w:sz w:val="36"/>
-          <w:szCs w:val="36"/>
-        </w:rPr>
-      </w:pPr>
-      <w:r>
-        <w:rPr>
-          <w:b/>
-          <w:bCs/>
-          <w:color w:val="D86DCB" w:themeColor="accent5" w:themeTint="99"/>
-          <w:sz w:val="36"/>
-          <w:szCs w:val="36"/>
-        </w:rPr>
-        <w:t xml:space="preserve">       If(</w:t>
-      </w:r>
-      <w:proofErr w:type="spellStart"/>
-      <w:r>
-        <w:rPr>
-          <w:b/>
-          <w:bCs/>
-          <w:color w:val="D86DCB" w:themeColor="accent5" w:themeTint="99"/>
-          <w:sz w:val="36"/>
-          <w:szCs w:val="36"/>
-        </w:rPr>
-        <w:t>iconWidget</w:t>
-      </w:r>
-      <w:proofErr w:type="spellEnd"/>
-      <w:r>
-        <w:rPr>
-          <w:b/>
-          <w:bCs/>
-          <w:color w:val="D86DCB" w:themeColor="accent5" w:themeTint="99"/>
-          <w:sz w:val="36"/>
-          <w:szCs w:val="36"/>
-        </w:rPr>
-        <w:t xml:space="preserve"> != null) </w:t>
-      </w:r>
-      <w:proofErr w:type="spellStart"/>
-      <w:r>
-        <w:rPr>
-          <w:b/>
-          <w:bCs/>
-          <w:color w:val="D86DCB" w:themeColor="accent5" w:themeTint="99"/>
-          <w:sz w:val="36"/>
-          <w:szCs w:val="36"/>
-        </w:rPr>
-        <w:t>iconWidget</w:t>
-      </w:r>
-      <w:proofErr w:type="spellEnd"/>
-      <w:r>
-        <w:rPr>
-          <w:b/>
-          <w:bCs/>
-          <w:color w:val="D86DCB" w:themeColor="accent5" w:themeTint="99"/>
-          <w:sz w:val="36"/>
-          <w:szCs w:val="36"/>
-        </w:rPr>
-        <w:t>,</w:t>
-      </w:r>
-    </w:p>
-    <w:p>
-      <w:pPr>
-        <w:jc w:val="both"/>
-        <w:rPr>
-          <w:b/>
-          <w:bCs/>
-          <w:color w:val="D86DCB" w:themeColor="accent5" w:themeTint="99"/>
-          <w:sz w:val="36"/>
-          <w:szCs w:val="36"/>
-        </w:rPr>
-      </w:pPr>
-      <w:r>
-        <w:rPr>
-          <w:b/>
-          <w:bCs/>
-          <w:color w:val="D86DCB" w:themeColor="accent5" w:themeTint="99"/>
-          <w:sz w:val="36"/>
-          <w:szCs w:val="36"/>
-        </w:rPr>
-        <w:t xml:space="preserve">       If(</w:t>
-      </w:r>
-      <w:proofErr w:type="spellStart"/>
-      <w:r>
-        <w:rPr>
-          <w:b/>
-          <w:bCs/>
-          <w:color w:val="D86DCB" w:themeColor="accent5" w:themeTint="99"/>
-          <w:sz w:val="36"/>
-          <w:szCs w:val="36"/>
-        </w:rPr>
-        <w:t>footerWidget</w:t>
-      </w:r>
-      <w:proofErr w:type="spellEnd"/>
-      <w:r>
-        <w:rPr>
-          <w:b/>
-          <w:bCs/>
-          <w:color w:val="D86DCB" w:themeColor="accent5" w:themeTint="99"/>
-          <w:sz w:val="36"/>
-          <w:szCs w:val="36"/>
-        </w:rPr>
-        <w:t xml:space="preserve"> != null) </w:t>
-      </w:r>
-      <w:proofErr w:type="spellStart"/>
-      <w:r>
-        <w:rPr>
-          <w:b/>
-          <w:bCs/>
-          <w:color w:val="D86DCB" w:themeColor="accent5" w:themeTint="99"/>
-          <w:sz w:val="36"/>
-          <w:szCs w:val="36"/>
-        </w:rPr>
-        <w:t>footerWidget</w:t>
-      </w:r>
-      <w:proofErr w:type="spellEnd"/>
-      <w:r>
-        <w:rPr>
-          <w:b/>
-          <w:bCs/>
-          <w:color w:val="D86DCB" w:themeColor="accent5" w:themeTint="99"/>
-          <w:sz w:val="36"/>
-          <w:szCs w:val="36"/>
-        </w:rPr>
-        <w:t>,</w:t>
-      </w:r>
-    </w:p>
-    <w:p>
-      <w:pPr>
-        <w:jc w:val="both"/>
-        <w:rPr>
-          <w:b/>
-          <w:bCs/>
-          <w:color w:val="D86DCB" w:themeColor="accent5" w:themeTint="99"/>
-          <w:sz w:val="36"/>
-          <w:szCs w:val="36"/>
-        </w:rPr>
-      </w:pPr>
-      <w:r>
-        <w:rPr>
-          <w:b/>
-          <w:bCs/>
-          <w:color w:val="D86DCB" w:themeColor="accent5" w:themeTint="99"/>
-          <w:sz w:val="36"/>
-          <w:szCs w:val="36"/>
-        </w:rPr>
-        <w:t xml:space="preserve">    ],</w:t>
+        <w:t>Difference with Spread Operator:</w:t>
+      </w:r>
+    </w:p>
+    <w:p>
+      <w:pPr>
+        <w:jc w:val="both"/>
+        <w:rPr>
+          <w:sz w:val="36"/>
+          <w:szCs w:val="36"/>
+        </w:rPr>
+      </w:pPr>
+      <w:proofErr w:type="gramStart"/>
+      <w:r>
+        <w:rPr>
+          <w:sz w:val="36"/>
+          <w:szCs w:val="36"/>
+        </w:rPr>
+        <w:t xml:space="preserve"># </w:t>
+      </w:r>
+      <w:r>
+        <w:rPr>
+          <w:b/>
+          <w:bCs/>
+          <w:sz w:val="36"/>
+          <w:szCs w:val="36"/>
+        </w:rPr>
+        <w:t>?item</w:t>
+      </w:r>
+      <w:proofErr w:type="gramEnd"/>
+      <w:r>
+        <w:rPr>
+          <w:b/>
+          <w:bCs/>
+          <w:sz w:val="36"/>
+          <w:szCs w:val="36"/>
+        </w:rPr>
+        <w:t xml:space="preserve"> </w:t>
+      </w:r>
+      <w:r>
+        <w:rPr>
+          <w:sz w:val="36"/>
+          <w:szCs w:val="36"/>
+        </w:rPr>
+        <w:t>means c</w:t>
+      </w:r>
+      <w:r>
+        <w:rPr>
+          <w:sz w:val="36"/>
+          <w:szCs w:val="36"/>
+        </w:rPr>
+        <w:t>onditionally insert if non-null</w:t>
+      </w:r>
+      <w:r>
+        <w:rPr>
+          <w:sz w:val="36"/>
+          <w:szCs w:val="36"/>
+        </w:rPr>
+        <w:t xml:space="preserve"> and </w:t>
+      </w:r>
+      <w:r>
+        <w:rPr>
+          <w:b/>
+          <w:bCs/>
+          <w:sz w:val="36"/>
+          <w:szCs w:val="36"/>
+        </w:rPr>
+        <w:t>...?list</w:t>
+      </w:r>
+      <w:r>
+        <w:rPr>
+          <w:sz w:val="36"/>
+          <w:szCs w:val="36"/>
+        </w:rPr>
+        <w:t xml:space="preserve"> means s</w:t>
+      </w:r>
+      <w:r>
+        <w:rPr>
+          <w:sz w:val="36"/>
+          <w:szCs w:val="36"/>
+        </w:rPr>
+        <w:t>pread list</w:t>
+      </w:r>
+      <w:r>
+        <w:rPr>
+          <w:sz w:val="36"/>
+          <w:szCs w:val="36"/>
+        </w:rPr>
+        <w:t xml:space="preserve"> (paste list)</w:t>
+      </w:r>
+      <w:r>
+        <w:rPr>
+          <w:sz w:val="36"/>
+          <w:szCs w:val="36"/>
+        </w:rPr>
+        <w:t xml:space="preserve"> if non-null</w:t>
+      </w:r>
+      <w:r>
+        <w:rPr>
+          <w:sz w:val="36"/>
+          <w:szCs w:val="36"/>
+        </w:rPr>
+        <w:t>.</w:t>
+      </w:r>
+    </w:p>
+    <w:p>
+      <w:pPr>
+        <w:jc w:val="both"/>
+        <w:rPr>
+          <w:sz w:val="36"/>
+          <w:szCs w:val="36"/>
+        </w:rPr>
+      </w:pPr>
+      <w:proofErr w:type="gramStart"/>
+      <w:r>
+        <w:rPr>
+          <w:sz w:val="36"/>
+          <w:szCs w:val="36"/>
+        </w:rPr>
+        <w:t xml:space="preserve"># </w:t>
+      </w:r>
+      <w:r>
+        <w:rPr>
+          <w:b/>
+          <w:bCs/>
+          <w:sz w:val="36"/>
+          <w:szCs w:val="36"/>
+        </w:rPr>
+        <w:t>?item</w:t>
+      </w:r>
+      <w:proofErr w:type="gramEnd"/>
+      <w:r>
+        <w:rPr>
+          <w:sz w:val="36"/>
+          <w:szCs w:val="36"/>
+        </w:rPr>
+        <w:t xml:space="preserve"> adds one nullable item</w:t>
+      </w:r>
+    </w:p>
+    <w:p>
+      <w:pPr>
+        <w:jc w:val="both"/>
+        <w:rPr>
+          <w:b/>
+          <w:bCs/>
+          <w:color w:val="D86DCB" w:themeColor="accent5" w:themeTint="99"/>
+          <w:sz w:val="36"/>
+          <w:szCs w:val="36"/>
+        </w:rPr>
+      </w:pPr>
+      <w:proofErr w:type="gramStart"/>
+      <w:r>
+        <w:rPr>
+          <w:b/>
+          <w:bCs/>
+          <w:color w:val="D86DCB" w:themeColor="accent5" w:themeTint="99"/>
+          <w:sz w:val="36"/>
+          <w:szCs w:val="36"/>
+        </w:rPr>
+        <w:t>Row(</w:t>
+      </w:r>
+      <w:proofErr w:type="gramEnd"/>
+    </w:p>
+    <w:p>
+      <w:pPr>
+        <w:jc w:val="both"/>
+        <w:rPr>
+          <w:b/>
+          <w:bCs/>
+          <w:color w:val="D86DCB" w:themeColor="accent5" w:themeTint="99"/>
+          <w:sz w:val="36"/>
+          <w:szCs w:val="36"/>
+        </w:rPr>
+      </w:pPr>
+      <w:r>
+        <w:rPr>
+          <w:b/>
+          <w:bCs/>
+          <w:color w:val="D86DCB" w:themeColor="accent5" w:themeTint="99"/>
+          <w:sz w:val="36"/>
+          <w:szCs w:val="36"/>
+        </w:rPr>
+        <w:t>…</w:t>
+      </w:r>
+    </w:p>
+    <w:p>
+      <w:pPr>
+        <w:jc w:val="both"/>
+        <w:rPr>
+          <w:b/>
+          <w:bCs/>
+          <w:color w:val="D86DCB" w:themeColor="accent5" w:themeTint="99"/>
+          <w:sz w:val="36"/>
+          <w:szCs w:val="36"/>
+        </w:rPr>
+      </w:pPr>
+      <w:r>
+        <w:rPr>
+          <w:b/>
+          <w:bCs/>
+          <w:color w:val="D86DCB" w:themeColor="accent5" w:themeTint="99"/>
+          <w:sz w:val="36"/>
+          <w:szCs w:val="36"/>
+        </w:rPr>
+        <w:t xml:space="preserve">  </w:t>
+      </w:r>
+      <w:r>
+        <w:rPr>
+          <w:b/>
+          <w:bCs/>
+          <w:color w:val="D86DCB" w:themeColor="accent5" w:themeTint="99"/>
+          <w:sz w:val="36"/>
+          <w:szCs w:val="36"/>
+        </w:rPr>
+        <w:t xml:space="preserve"> </w:t>
+      </w:r>
+      <w:r>
+        <w:rPr>
+          <w:b/>
+          <w:bCs/>
+          <w:color w:val="D86DCB" w:themeColor="accent5" w:themeTint="99"/>
+          <w:sz w:val="36"/>
+          <w:szCs w:val="36"/>
+        </w:rPr>
+        <w:t>[</w:t>
+      </w:r>
+    </w:p>
+    <w:p>
+      <w:pPr>
+        <w:jc w:val="both"/>
+        <w:rPr>
+          <w:b/>
+          <w:bCs/>
+          <w:color w:val="D86DCB" w:themeColor="accent5" w:themeTint="99"/>
+          <w:sz w:val="36"/>
+          <w:szCs w:val="36"/>
+        </w:rPr>
+      </w:pPr>
+      <w:r>
+        <w:rPr>
+          <w:b/>
+          <w:bCs/>
+          <w:color w:val="D86DCB" w:themeColor="accent5" w:themeTint="99"/>
+          <w:sz w:val="36"/>
+          <w:szCs w:val="36"/>
+        </w:rPr>
+        <w:t xml:space="preserve">  </w:t>
+      </w:r>
+      <w:r>
+        <w:rPr>
+          <w:b/>
+          <w:bCs/>
+          <w:color w:val="D86DCB" w:themeColor="accent5" w:themeTint="99"/>
+          <w:sz w:val="36"/>
+          <w:szCs w:val="36"/>
+        </w:rPr>
+        <w:t xml:space="preserve">    </w:t>
+      </w:r>
+      <w:proofErr w:type="gramStart"/>
+      <w:r>
+        <w:rPr>
+          <w:b/>
+          <w:bCs/>
+          <w:color w:val="D86DCB" w:themeColor="accent5" w:themeTint="99"/>
+          <w:sz w:val="36"/>
+          <w:szCs w:val="36"/>
+        </w:rPr>
+        <w:t>?widget</w:t>
+      </w:r>
+      <w:proofErr w:type="gramEnd"/>
+    </w:p>
+    <w:p>
+      <w:pPr>
+        <w:jc w:val="both"/>
+        <w:rPr>
+          <w:b/>
+          <w:bCs/>
+          <w:color w:val="D86DCB" w:themeColor="accent5" w:themeTint="99"/>
+          <w:sz w:val="36"/>
+          <w:szCs w:val="36"/>
+        </w:rPr>
+      </w:pPr>
+      <w:r>
+        <w:rPr>
+          <w:b/>
+          <w:bCs/>
+          <w:color w:val="D86DCB" w:themeColor="accent5" w:themeTint="99"/>
+          <w:sz w:val="36"/>
+          <w:szCs w:val="36"/>
+        </w:rPr>
+        <w:t xml:space="preserve">  ]</w:t>
       </w:r>
     </w:p>
     <w:p>
@@ -3545,227 +4311,158 @@
           <w:sz w:val="36"/>
           <w:szCs w:val="36"/>
         </w:rPr>
-        <w:t># New way after null aware elements:</w:t>
-      </w:r>
-    </w:p>
-    <w:p>
-      <w:pPr>
-        <w:jc w:val="both"/>
-        <w:rPr>
-          <w:b/>
-          <w:bCs/>
-          <w:color w:val="D86DCB" w:themeColor="accent5" w:themeTint="99"/>
-          <w:sz w:val="36"/>
-          <w:szCs w:val="36"/>
-        </w:rPr>
-      </w:pPr>
-      <w:r>
-        <w:rPr>
-          <w:b/>
-          <w:bCs/>
-          <w:color w:val="D86DCB" w:themeColor="accent5" w:themeTint="99"/>
-          <w:sz w:val="36"/>
-          <w:szCs w:val="36"/>
-        </w:rPr>
-        <w:t>Column(</w:t>
-      </w:r>
-    </w:p>
-    <w:p>
-      <w:pPr>
-        <w:jc w:val="both"/>
-        <w:rPr>
-          <w:b/>
-          <w:bCs/>
-          <w:color w:val="D86DCB" w:themeColor="accent5" w:themeTint="99"/>
-          <w:sz w:val="36"/>
-          <w:szCs w:val="36"/>
-        </w:rPr>
-      </w:pPr>
-      <w:r>
-        <w:rPr>
-          <w:b/>
-          <w:bCs/>
-          <w:color w:val="D86DCB" w:themeColor="accent5" w:themeTint="99"/>
-          <w:sz w:val="36"/>
-          <w:szCs w:val="36"/>
-        </w:rPr>
-        <w:t xml:space="preserve">    children: [</w:t>
-      </w:r>
-    </w:p>
-    <w:p>
-      <w:pPr>
-        <w:jc w:val="both"/>
-        <w:rPr>
-          <w:b/>
-          <w:bCs/>
-          <w:color w:val="D86DCB" w:themeColor="accent5" w:themeTint="99"/>
-          <w:sz w:val="36"/>
-          <w:szCs w:val="36"/>
-        </w:rPr>
-      </w:pPr>
-      <w:r>
-        <w:rPr>
-          <w:b/>
-          <w:bCs/>
-          <w:color w:val="D86DCB" w:themeColor="accent5" w:themeTint="99"/>
-          <w:sz w:val="36"/>
-          <w:szCs w:val="36"/>
-        </w:rPr>
-        <w:t xml:space="preserve">       Text('Title'),</w:t>
-      </w:r>
-    </w:p>
-    <w:p>
-      <w:pPr>
-        <w:jc w:val="both"/>
-        <w:rPr>
-          <w:b/>
-          <w:bCs/>
-          <w:color w:val="D86DCB" w:themeColor="accent5" w:themeTint="99"/>
-          <w:sz w:val="36"/>
-          <w:szCs w:val="36"/>
-        </w:rPr>
-      </w:pPr>
-      <w:r>
-        <w:rPr>
-          <w:b/>
-          <w:bCs/>
-          <w:color w:val="D86DCB" w:themeColor="accent5" w:themeTint="99"/>
-          <w:sz w:val="36"/>
-          <w:szCs w:val="36"/>
-        </w:rPr>
-        <w:t xml:space="preserve">       ?</w:t>
-      </w:r>
-      <w:proofErr w:type="spellStart"/>
-      <w:r>
-        <w:rPr>
-          <w:b/>
-          <w:bCs/>
-          <w:color w:val="D86DCB" w:themeColor="accent5" w:themeTint="99"/>
-          <w:sz w:val="36"/>
-          <w:szCs w:val="36"/>
-        </w:rPr>
-        <w:t>subTitleWidget</w:t>
-      </w:r>
-      <w:proofErr w:type="spellEnd"/>
-      <w:r>
-        <w:rPr>
-          <w:b/>
-          <w:bCs/>
-          <w:color w:val="D86DCB" w:themeColor="accent5" w:themeTint="99"/>
-          <w:sz w:val="36"/>
-          <w:szCs w:val="36"/>
-        </w:rPr>
-        <w:t>,</w:t>
-      </w:r>
-    </w:p>
-    <w:p>
-      <w:pPr>
-        <w:jc w:val="both"/>
-        <w:rPr>
-          <w:b/>
-          <w:bCs/>
-          <w:color w:val="D86DCB" w:themeColor="accent5" w:themeTint="99"/>
-          <w:sz w:val="36"/>
-          <w:szCs w:val="36"/>
-        </w:rPr>
-      </w:pPr>
-      <w:r>
-        <w:rPr>
-          <w:b/>
-          <w:bCs/>
-          <w:color w:val="D86DCB" w:themeColor="accent5" w:themeTint="99"/>
-          <w:sz w:val="36"/>
-          <w:szCs w:val="36"/>
-        </w:rPr>
-        <w:t xml:space="preserve">       ?</w:t>
-      </w:r>
-      <w:proofErr w:type="spellStart"/>
-      <w:r>
-        <w:rPr>
-          <w:b/>
-          <w:bCs/>
-          <w:color w:val="D86DCB" w:themeColor="accent5" w:themeTint="99"/>
-          <w:sz w:val="36"/>
-          <w:szCs w:val="36"/>
-        </w:rPr>
-        <w:t>iconWidget</w:t>
-      </w:r>
-      <w:proofErr w:type="spellEnd"/>
-      <w:r>
-        <w:rPr>
-          <w:b/>
-          <w:bCs/>
-          <w:color w:val="D86DCB" w:themeColor="accent5" w:themeTint="99"/>
-          <w:sz w:val="36"/>
-          <w:szCs w:val="36"/>
-        </w:rPr>
-        <w:t>,</w:t>
-      </w:r>
-    </w:p>
-    <w:p>
-      <w:pPr>
-        <w:jc w:val="both"/>
-        <w:rPr>
-          <w:b/>
-          <w:bCs/>
-          <w:color w:val="D86DCB" w:themeColor="accent5" w:themeTint="99"/>
-          <w:sz w:val="36"/>
-          <w:szCs w:val="36"/>
-        </w:rPr>
-      </w:pPr>
-      <w:r>
-        <w:rPr>
-          <w:b/>
-          <w:bCs/>
-          <w:color w:val="D86DCB" w:themeColor="accent5" w:themeTint="99"/>
-          <w:sz w:val="36"/>
-          <w:szCs w:val="36"/>
-        </w:rPr>
-        <w:t xml:space="preserve">       ?</w:t>
-      </w:r>
-      <w:proofErr w:type="spellStart"/>
-      <w:r>
-        <w:rPr>
-          <w:b/>
-          <w:bCs/>
-          <w:color w:val="D86DCB" w:themeColor="accent5" w:themeTint="99"/>
-          <w:sz w:val="36"/>
-          <w:szCs w:val="36"/>
-        </w:rPr>
-        <w:t>footerWidget</w:t>
-      </w:r>
-      <w:proofErr w:type="spellEnd"/>
-      <w:r>
-        <w:rPr>
-          <w:b/>
-          <w:bCs/>
-          <w:color w:val="D86DCB" w:themeColor="accent5" w:themeTint="99"/>
-          <w:sz w:val="36"/>
-          <w:szCs w:val="36"/>
-        </w:rPr>
-        <w:t>,</w:t>
-      </w:r>
-    </w:p>
-    <w:p>
-      <w:pPr>
-        <w:jc w:val="both"/>
-        <w:rPr>
-          <w:b/>
-          <w:bCs/>
-          <w:color w:val="D86DCB" w:themeColor="accent5" w:themeTint="99"/>
-          <w:sz w:val="36"/>
-          <w:szCs w:val="36"/>
-        </w:rPr>
-      </w:pPr>
-      <w:r>
-        <w:rPr>
-          <w:b/>
-          <w:bCs/>
-          <w:color w:val="D86DCB" w:themeColor="accent5" w:themeTint="99"/>
-          <w:sz w:val="36"/>
-          <w:szCs w:val="36"/>
-        </w:rPr>
-        <w:t xml:space="preserve">    ],</w:t>
+        <w:t># While</w:t>
+      </w:r>
+      <w:r>
+        <w:rPr>
+          <w:b/>
+          <w:bCs/>
+          <w:sz w:val="36"/>
+          <w:szCs w:val="36"/>
+        </w:rPr>
+        <w:t xml:space="preserve"> </w:t>
+      </w:r>
+      <w:proofErr w:type="gramStart"/>
+      <w:r>
+        <w:rPr>
+          <w:b/>
+          <w:bCs/>
+          <w:sz w:val="36"/>
+          <w:szCs w:val="36"/>
+        </w:rPr>
+        <w:t>…?list</w:t>
+      </w:r>
+      <w:proofErr w:type="gramEnd"/>
+      <w:r>
+        <w:rPr>
+          <w:sz w:val="36"/>
+          <w:szCs w:val="36"/>
+        </w:rPr>
+        <w:t xml:space="preserve"> adds many nullable items (if not null)</w:t>
+      </w:r>
+    </w:p>
+    <w:p>
+      <w:pPr>
+        <w:jc w:val="both"/>
+        <w:rPr>
+          <w:b/>
+          <w:bCs/>
+          <w:color w:val="D86DCB" w:themeColor="accent5" w:themeTint="99"/>
+          <w:sz w:val="36"/>
+          <w:szCs w:val="36"/>
+        </w:rPr>
+      </w:pPr>
+      <w:proofErr w:type="gramStart"/>
+      <w:r>
+        <w:rPr>
+          <w:b/>
+          <w:bCs/>
+          <w:color w:val="D86DCB" w:themeColor="accent5" w:themeTint="99"/>
+          <w:sz w:val="36"/>
+          <w:szCs w:val="36"/>
+        </w:rPr>
+        <w:t>Row(</w:t>
+      </w:r>
+      <w:proofErr w:type="gramEnd"/>
+    </w:p>
+    <w:p>
+      <w:pPr>
+        <w:jc w:val="both"/>
+        <w:rPr>
+          <w:b/>
+          <w:bCs/>
+          <w:color w:val="D86DCB" w:themeColor="accent5" w:themeTint="99"/>
+          <w:sz w:val="36"/>
+          <w:szCs w:val="36"/>
+        </w:rPr>
+      </w:pPr>
+      <w:r>
+        <w:rPr>
+          <w:b/>
+          <w:bCs/>
+          <w:color w:val="D86DCB" w:themeColor="accent5" w:themeTint="99"/>
+          <w:sz w:val="36"/>
+          <w:szCs w:val="36"/>
+        </w:rPr>
+        <w:t>…</w:t>
+      </w:r>
+    </w:p>
+    <w:p>
+      <w:pPr>
+        <w:jc w:val="both"/>
+        <w:rPr>
+          <w:b/>
+          <w:bCs/>
+          <w:color w:val="D86DCB" w:themeColor="accent5" w:themeTint="99"/>
+          <w:sz w:val="36"/>
+          <w:szCs w:val="36"/>
+        </w:rPr>
+      </w:pPr>
+      <w:r>
+        <w:rPr>
+          <w:b/>
+          <w:bCs/>
+          <w:color w:val="D86DCB" w:themeColor="accent5" w:themeTint="99"/>
+          <w:sz w:val="36"/>
+          <w:szCs w:val="36"/>
+        </w:rPr>
+        <w:t xml:space="preserve">   [</w:t>
+      </w:r>
+    </w:p>
+    <w:p>
+      <w:pPr>
+        <w:jc w:val="both"/>
+        <w:rPr>
+          <w:b/>
+          <w:bCs/>
+          <w:color w:val="D86DCB" w:themeColor="accent5" w:themeTint="99"/>
+          <w:sz w:val="36"/>
+          <w:szCs w:val="36"/>
+        </w:rPr>
+      </w:pPr>
+      <w:r>
+        <w:rPr>
+          <w:b/>
+          <w:bCs/>
+          <w:color w:val="D86DCB" w:themeColor="accent5" w:themeTint="99"/>
+          <w:sz w:val="36"/>
+          <w:szCs w:val="36"/>
+        </w:rPr>
+        <w:t xml:space="preserve">      </w:t>
+      </w:r>
+      <w:proofErr w:type="gramStart"/>
+      <w:r>
+        <w:rPr>
+          <w:b/>
+          <w:bCs/>
+          <w:color w:val="D86DCB" w:themeColor="accent5" w:themeTint="99"/>
+          <w:sz w:val="36"/>
+          <w:szCs w:val="36"/>
+        </w:rPr>
+        <w:t>…?widgets</w:t>
+      </w:r>
+      <w:proofErr w:type="gramEnd"/>
+    </w:p>
+    <w:p>
+      <w:pPr>
+        <w:jc w:val="both"/>
+        <w:rPr>
+          <w:b/>
+          <w:bCs/>
+          <w:color w:val="D86DCB" w:themeColor="accent5" w:themeTint="99"/>
+          <w:sz w:val="36"/>
+          <w:szCs w:val="36"/>
+        </w:rPr>
+      </w:pPr>
+      <w:r>
+        <w:rPr>
+          <w:b/>
+          <w:bCs/>
+          <w:color w:val="D86DCB" w:themeColor="accent5" w:themeTint="99"/>
+          <w:sz w:val="36"/>
+          <w:szCs w:val="36"/>
+        </w:rPr>
+        <w:t xml:space="preserve">  ]</w:t>
       </w:r>
     </w:p>
     <w:p>
@@ -3788,6 +4485,231 @@
           <w:szCs w:val="36"/>
         </w:rPr>
         <w:t>)</w:t>
+      </w:r>
+    </w:p>
+    <w:p>
+      <w:pPr>
+        <w:jc w:val="both"/>
+        <w:rPr>
+          <w:sz w:val="36"/>
+          <w:szCs w:val="36"/>
+        </w:rPr>
+      </w:pPr>
+    </w:p>
+    <w:p>
+      <w:pPr>
+        <w:jc w:val="both"/>
+        <w:rPr>
+          <w:sz w:val="36"/>
+          <w:szCs w:val="36"/>
+        </w:rPr>
+      </w:pPr>
+      <w:r>
+        <w:rPr>
+          <w:sz w:val="36"/>
+          <w:szCs w:val="36"/>
+        </w:rPr>
+        <w:t>Importance:</w:t>
+      </w:r>
+    </w:p>
+    <w:p>
+      <w:pPr>
+        <w:jc w:val="both"/>
+        <w:rPr>
+          <w:sz w:val="36"/>
+          <w:szCs w:val="36"/>
+        </w:rPr>
+      </w:pPr>
+      <w:r>
+        <w:rPr>
+          <w:sz w:val="36"/>
+          <w:szCs w:val="36"/>
+        </w:rPr>
+        <w:t xml:space="preserve"># </w:t>
+      </w:r>
+      <w:r>
+        <w:rPr>
+          <w:b/>
+          <w:bCs/>
+          <w:sz w:val="36"/>
+          <w:szCs w:val="36"/>
+        </w:rPr>
+        <w:t>Dart</w:t>
+      </w:r>
+      <w:r>
+        <w:rPr>
+          <w:sz w:val="36"/>
+          <w:szCs w:val="36"/>
+        </w:rPr>
+        <w:t xml:space="preserve"> added this</w:t>
+      </w:r>
+      <w:r>
+        <w:rPr>
+          <w:sz w:val="36"/>
+          <w:szCs w:val="36"/>
+        </w:rPr>
+        <w:t xml:space="preserve"> b</w:t>
+      </w:r>
+      <w:r>
+        <w:rPr>
+          <w:sz w:val="36"/>
+          <w:szCs w:val="36"/>
+        </w:rPr>
+        <w:t>ecause</w:t>
+      </w:r>
+      <w:r>
+        <w:rPr>
+          <w:b/>
+          <w:bCs/>
+          <w:sz w:val="36"/>
+          <w:szCs w:val="36"/>
+        </w:rPr>
+        <w:t xml:space="preserve"> Flutter</w:t>
+      </w:r>
+      <w:r>
+        <w:rPr>
+          <w:sz w:val="36"/>
+          <w:szCs w:val="36"/>
+        </w:rPr>
+        <w:t xml:space="preserve"> developers write collection literals CONSTANTLY:</w:t>
+      </w:r>
+    </w:p>
+    <w:p>
+      <w:pPr>
+        <w:pStyle w:val="ListParagraph"/>
+        <w:numPr>
+          <w:ilvl w:val="0"/>
+          <w:numId w:val="2"/>
+        </w:numPr>
+        <w:jc w:val="both"/>
+        <w:rPr>
+          <w:b/>
+          <w:bCs/>
+          <w:sz w:val="36"/>
+          <w:szCs w:val="36"/>
+        </w:rPr>
+      </w:pPr>
+      <w:r>
+        <w:rPr>
+          <w:b/>
+          <w:bCs/>
+          <w:sz w:val="36"/>
+          <w:szCs w:val="36"/>
+        </w:rPr>
+        <w:lastRenderedPageBreak/>
+        <w:t>children: []</w:t>
+      </w:r>
+    </w:p>
+    <w:p>
+      <w:pPr>
+        <w:pStyle w:val="ListParagraph"/>
+        <w:numPr>
+          <w:ilvl w:val="0"/>
+          <w:numId w:val="2"/>
+        </w:numPr>
+        <w:jc w:val="both"/>
+        <w:rPr>
+          <w:b/>
+          <w:bCs/>
+          <w:sz w:val="36"/>
+          <w:szCs w:val="36"/>
+        </w:rPr>
+      </w:pPr>
+      <w:r>
+        <w:rPr>
+          <w:b/>
+          <w:bCs/>
+          <w:sz w:val="36"/>
+          <w:szCs w:val="36"/>
+        </w:rPr>
+        <w:t>actions: []</w:t>
+      </w:r>
+    </w:p>
+    <w:p>
+      <w:pPr>
+        <w:pStyle w:val="ListParagraph"/>
+        <w:numPr>
+          <w:ilvl w:val="0"/>
+          <w:numId w:val="2"/>
+        </w:numPr>
+        <w:jc w:val="both"/>
+        <w:rPr>
+          <w:b/>
+          <w:bCs/>
+          <w:sz w:val="36"/>
+          <w:szCs w:val="36"/>
+        </w:rPr>
+      </w:pPr>
+      <w:r>
+        <w:rPr>
+          <w:b/>
+          <w:bCs/>
+          <w:sz w:val="36"/>
+          <w:szCs w:val="36"/>
+        </w:rPr>
+        <w:t>items: []</w:t>
+      </w:r>
+    </w:p>
+    <w:p>
+      <w:pPr>
+        <w:pStyle w:val="ListParagraph"/>
+        <w:numPr>
+          <w:ilvl w:val="0"/>
+          <w:numId w:val="2"/>
+        </w:numPr>
+        <w:jc w:val="both"/>
+        <w:rPr>
+          <w:b/>
+          <w:bCs/>
+          <w:sz w:val="36"/>
+          <w:szCs w:val="36"/>
+        </w:rPr>
+      </w:pPr>
+      <w:r>
+        <w:rPr>
+          <w:b/>
+          <w:bCs/>
+          <w:sz w:val="36"/>
+          <w:szCs w:val="36"/>
+        </w:rPr>
+        <w:t>slivers: []</w:t>
+      </w:r>
+    </w:p>
+    <w:p>
+      <w:pPr>
+        <w:jc w:val="both"/>
+        <w:rPr>
+          <w:sz w:val="36"/>
+          <w:szCs w:val="36"/>
+        </w:rPr>
+      </w:pPr>
+      <w:r>
+        <w:rPr>
+          <w:sz w:val="36"/>
+          <w:szCs w:val="36"/>
+        </w:rPr>
+        <w:t xml:space="preserve"># </w:t>
+      </w:r>
+      <w:r>
+        <w:rPr>
+          <w:sz w:val="36"/>
+          <w:szCs w:val="36"/>
+        </w:rPr>
+        <w:t>And</w:t>
+      </w:r>
+      <w:r>
+        <w:rPr>
+          <w:sz w:val="36"/>
+          <w:szCs w:val="36"/>
+        </w:rPr>
+        <w:t xml:space="preserve"> adding</w:t>
+      </w:r>
+      <w:r>
+        <w:rPr>
+          <w:sz w:val="36"/>
+          <w:szCs w:val="36"/>
+        </w:rPr>
+        <w:t xml:space="preserve"> null-check boilerplate became annoying.</w:t>
       </w:r>
     </w:p>
     <w:p>
@@ -3925,6 +4847,119 @@
 <file path=word/numbering.xml><?xml version="1.0" encoding="utf-8"?>
 <w:numbering xmlns:wpc="http://schemas.microsoft.com/office/word/2010/wordprocessingCanvas" xmlns:cx="http://schemas.microsoft.com/office/drawing/2014/chartex" xmlns:cx1="http://schemas.microsoft.com/office/drawing/2015/9/8/chartex" xmlns:cx2="http://schemas.microsoft.com/office/drawing/2015/10/21/chartex" xmlns:cx3="http://schemas.microsoft.com/office/drawing/2016/5/9/chartex" xmlns:cx4="http://schemas.microsoft.com/office/drawing/2016/5/10/chartex" xmlns:cx5="http://schemas.microsoft.com/office/drawing/2016/5/11/chartex" xmlns:cx6="http://schemas.microsoft.com/office/drawing/2016/5/12/chartex" xmlns:cx7="http://schemas.microsoft.com/office/drawing/2016/5/13/chartex" xmlns:cx8="http://schemas.microsoft.com/office/drawing/2016/5/14/chartex" xmlns:mc="http://schemas.openxmlformats.org/markup-compatibility/2006" xmlns:aink="http://schemas.microsoft.com/office/drawing/2016/ink" xmlns:am3d="http://schemas.microsoft.com/office/drawing/2017/model3d" xmlns:o="urn:schemas-microsoft-com:office:office" xmlns:oel="http://schemas.microsoft.com/office/2019/extlst" xmlns:r="http://schemas.openxmlformats.org/officeDocument/2006/relationships" xmlns:m="http://schemas.openxmlformats.org/officeDocument/2006/math" xmlns:v="urn:schemas-microsoft-com:vml" xmlns:wp14="http://schemas.microsoft.com/office/word/2010/wordprocessingDrawing" xmlns:wp="http://schemas.openxmlformats.org/drawingml/2006/wordprocessingDrawing" xmlns:w10="urn:schemas-microsoft-com:office:word" xmlns:w="http://schemas.openxmlformats.org/wordprocessingml/2006/main" xmlns:w14="http://schemas.microsoft.com/office/word/2010/wordml" xmlns:w15="http://schemas.microsoft.com/office/word/2012/wordml" xmlns:w16cex="http://schemas.microsoft.com/office/word/2018/wordml/cex" xmlns:w16cid="http://schemas.microsoft.com/office/word/2016/wordml/cid" xmlns:w16="http://schemas.microsoft.com/office/word/2018/wordml" xmlns:w16sdtdh="http://schemas.microsoft.com/office/word/2020/wordml/sdtdatahash" xmlns:w16se="http://schemas.microsoft.com/office/word/2015/wordml/symex" xmlns:wpg="http://schemas.microsoft.com/office/word/2010/wordprocessingGroup" xmlns:wpi="http://schemas.microsoft.com/office/word/2010/wordprocessingInk" xmlns:wne="http://schemas.microsoft.com/office/word/2006/wordml" xmlns:wps="http://schemas.microsoft.com/office/word/2010/wordprocessingShape" mc:Ignorable="w14 w15 w16se w16cid w16 w16cex w16sdtdh wp14">
   <w:abstractNum w:abstractNumId="0" w15:restartNumberingAfterBreak="0">
+    <w:nsid w:val="279F34F6"/>
+    <w:multiLevelType w:val="hybridMultilevel"/>
+    <w:tmpl w:val="14707D12"/>
+    <w:lvl w:ilvl="0" w:tplc="04090001">
+      <w:start w:val="1"/>
+      <w:numFmt w:val="bullet"/>
+      <w:lvlText w:val=""/>
+      <w:lvlJc w:val="left"/>
+      <w:pPr>
+        <w:ind w:left="360" w:hanging="360"/>
+      </w:pPr>
+      <w:rPr>
+        <w:rFonts w:ascii="Symbol" w:hAnsi="Symbol" w:hint="default"/>
+      </w:rPr>
+    </w:lvl>
+    <w:lvl w:ilvl="1" w:tplc="04090003" w:tentative="1">
+      <w:start w:val="1"/>
+      <w:numFmt w:val="bullet"/>
+      <w:lvlText w:val="o"/>
+      <w:lvlJc w:val="left"/>
+      <w:pPr>
+        <w:ind w:left="1080" w:hanging="360"/>
+      </w:pPr>
+      <w:rPr>
+        <w:rFonts w:ascii="Courier New" w:hAnsi="Courier New" w:cs="Courier New" w:hint="default"/>
+      </w:rPr>
+    </w:lvl>
+    <w:lvl w:ilvl="2" w:tplc="04090005" w:tentative="1">
+      <w:start w:val="1"/>
+      <w:numFmt w:val="bullet"/>
+      <w:lvlText w:val=""/>
+      <w:lvlJc w:val="left"/>
+      <w:pPr>
+        <w:ind w:left="1800" w:hanging="360"/>
+      </w:pPr>
+      <w:rPr>
+        <w:rFonts w:ascii="Wingdings" w:hAnsi="Wingdings" w:hint="default"/>
+      </w:rPr>
+    </w:lvl>
+    <w:lvl w:ilvl="3" w:tplc="04090001" w:tentative="1">
+      <w:start w:val="1"/>
+      <w:numFmt w:val="bullet"/>
+      <w:lvlText w:val=""/>
+      <w:lvlJc w:val="left"/>
+      <w:pPr>
+        <w:ind w:left="2520" w:hanging="360"/>
+      </w:pPr>
+      <w:rPr>
+        <w:rFonts w:ascii="Symbol" w:hAnsi="Symbol" w:hint="default"/>
+      </w:rPr>
+    </w:lvl>
+    <w:lvl w:ilvl="4" w:tplc="04090003" w:tentative="1">
+      <w:start w:val="1"/>
+      <w:numFmt w:val="bullet"/>
+      <w:lvlText w:val="o"/>
+      <w:lvlJc w:val="left"/>
+      <w:pPr>
+        <w:ind w:left="3240" w:hanging="360"/>
+      </w:pPr>
+      <w:rPr>
+        <w:rFonts w:ascii="Courier New" w:hAnsi="Courier New" w:cs="Courier New" w:hint="default"/>
+      </w:rPr>
+    </w:lvl>
+    <w:lvl w:ilvl="5" w:tplc="04090005" w:tentative="1">
+      <w:start w:val="1"/>
+      <w:numFmt w:val="bullet"/>
+      <w:lvlText w:val=""/>
+      <w:lvlJc w:val="left"/>
+      <w:pPr>
+        <w:ind w:left="3960" w:hanging="360"/>
+      </w:pPr>
+      <w:rPr>
+        <w:rFonts w:ascii="Wingdings" w:hAnsi="Wingdings" w:hint="default"/>
+      </w:rPr>
+    </w:lvl>
+    <w:lvl w:ilvl="6" w:tplc="04090001" w:tentative="1">
+      <w:start w:val="1"/>
+      <w:numFmt w:val="bullet"/>
+      <w:lvlText w:val=""/>
+      <w:lvlJc w:val="left"/>
+      <w:pPr>
+        <w:ind w:left="4680" w:hanging="360"/>
+      </w:pPr>
+      <w:rPr>
+        <w:rFonts w:ascii="Symbol" w:hAnsi="Symbol" w:hint="default"/>
+      </w:rPr>
+    </w:lvl>
+    <w:lvl w:ilvl="7" w:tplc="04090003" w:tentative="1">
+      <w:start w:val="1"/>
+      <w:numFmt w:val="bullet"/>
+      <w:lvlText w:val="o"/>
+      <w:lvlJc w:val="left"/>
+      <w:pPr>
+        <w:ind w:left="5400" w:hanging="360"/>
+      </w:pPr>
+      <w:rPr>
+        <w:rFonts w:ascii="Courier New" w:hAnsi="Courier New" w:cs="Courier New" w:hint="default"/>
+      </w:rPr>
+    </w:lvl>
+    <w:lvl w:ilvl="8" w:tplc="04090005" w:tentative="1">
+      <w:start w:val="1"/>
+      <w:numFmt w:val="bullet"/>
+      <w:lvlText w:val=""/>
+      <w:lvlJc w:val="left"/>
+      <w:pPr>
+        <w:ind w:left="6120" w:hanging="360"/>
+      </w:pPr>
+      <w:rPr>
+        <w:rFonts w:ascii="Wingdings" w:hAnsi="Wingdings" w:hint="default"/>
+      </w:rPr>
+    </w:lvl>
+  </w:abstractNum>
+  <w:abstractNum w:abstractNumId="1" w15:restartNumberingAfterBreak="0">
     <w:nsid w:val="6F6B2FE8"/>
     <w:multiLevelType w:val="hybridMultilevel"/>
     <w:tmpl w:val="4CC81648"/>
@@ -4016,6 +5051,9 @@
     </w:lvl>
   </w:abstractNum>
   <w:num w:numId="1" w16cid:durableId="1424304154">
+    <w:abstractNumId w:val="1"/>
+  </w:num>
+  <w:num w:numId="2" w16cid:durableId="1690060198">
     <w:abstractNumId w:val="0"/>
   </w:num>
 </w:numbering>
@@ -4624,7 +5662,6 @@
   <w:style w:type="character" w:default="1" w:styleId="DefaultParagraphFont">
     <w:name w:val="Default Paragraph Font"/>
     <w:uiPriority w:val="1"/>
-    <w:semiHidden/>
     <w:unhideWhenUsed/>
   </w:style>
   <w:style w:type="table" w:default="1" w:styleId="TableNormal">

</xml_diff>